<commit_message>
Drop the invented signature field from the declaration
The template's section 8 asks for a date and nothing else. The signature row was
mine, added on the assumption that a declaration ought to have one, which is not
the same as the organisers requesting it. An extra field is one the entrant has
to explain rather than one that was asked for, so it is gone.

Checked that the only remaining occurrences of the word are the technical sense:
electrical signature, switching signature, and motor current signature
analysis.
</commit_message>
<xml_diff>
--- a/docs/report/Udyog_IQ_Project_Report.docx
+++ b/docs/report/Udyog_IQ_Project_Report.docx
@@ -7224,63 +7224,6 @@
                 <w:szCs w:val="19"/>
               </w:rPr>
               <w:t xml:space="preserve">date of submission</w:t>
-            </w:r>
-          </w:p>
-        </w:tc>
-      </w:tr>
-      <w:tr>
-        <w:tc>
-          <w:tcPr>
-            <w:tcW w:type="dxa" w:w="2900"/>
-            <w:shd w:fill="F2F5F9" w:val="clear"/>
-            <w:tcMar>
-              <w:top w:type="dxa" w:w="90"/>
-              <w:left w:type="dxa" w:w="130"/>
-              <w:bottom w:type="dxa" w:w="90"/>
-              <w:right w:type="dxa" w:w="130"/>
-            </w:tcMar>
-          </w:tcPr>
-          <w:p>
-            <w:pPr>
-              <w:spacing w:after="0" w:line="264"/>
-            </w:pPr>
-            <w:r>
-              <w:rPr>
-                <w:rFonts w:ascii="Calibri" w:cs="Calibri" w:eastAsia="Calibri" w:hAnsi="Calibri"/>
-                <w:b/>
-                <w:bCs/>
-                <w:color w:val="1A1A1A"/>
-                <w:sz w:val="19"/>
-                <w:szCs w:val="19"/>
-              </w:rPr>
-              <w:t xml:space="preserve">Team Leader signature</w:t>
-            </w:r>
-          </w:p>
-        </w:tc>
-        <w:tc>
-          <w:tcPr>
-            <w:tcW w:type="dxa" w:w="6460"/>
-            <w:tcMar>
-              <w:top w:type="dxa" w:w="90"/>
-              <w:left w:type="dxa" w:w="130"/>
-              <w:bottom w:type="dxa" w:w="90"/>
-              <w:right w:type="dxa" w:w="130"/>
-            </w:tcMar>
-          </w:tcPr>
-          <w:p>
-            <w:pPr>
-              <w:spacing w:after="0" w:line="264"/>
-            </w:pPr>
-            <w:r>
-              <w:rPr>
-                <w:rFonts w:ascii="Calibri" w:cs="Calibri" w:eastAsia="Calibri" w:hAnsi="Calibri"/>
-                <w:i/>
-                <w:iCs/>
-                <w:color w:val="B03A2E"/>
-                <w:sz w:val="19"/>
-                <w:szCs w:val="19"/>
-              </w:rPr>
-              <w:t xml:space="preserve">sign here</w:t>
             </w:r>
           </w:p>
         </w:tc>

</xml_diff>